<commit_message>
Add autoimmune KB, cancer co-management, food reactions, testing info, fertility/gut focus, and booking flow updates
- Add comprehensive autoimmune conditions KB (Dr. Nurani specialty) with all 9 categories
- Add cancer co-management section for Dr. Nurani (diet, IV nutrition, botanicals)
- Add food reactions education: allergies vs sensitivities vs intolerances, histamine clarification
- Add testing overview: standardized vs functional testing, Alberta cost info, insurance billing
- Add dedicated fertility trigger recommending Dr. Alexa and Dr. Marisa
- Update gut health as focus area for all 3 NDs (Nurani, Hucal, Torontow)
- Move Initial Consultation under Naturopathic Medicine in booking flow
- Add testing known topic for instant answers on testing inquiries
- Expand autoimmune and cancer keyword triggers in chat

Co-Authored-By: Claude Opus 4.6 <noreply@anthropic.com>
</commit_message>
<xml_diff>
--- a/kb/sources/nova_clinic_functional_testing.docx
+++ b/kb/sources/nova_clinic_functional_testing.docx
@@ -5,6 +5,38 @@
     <w:p>
       <w:pPr>
         <w:pStyle w:val="Heading1"/>
+      </w:pPr>
+      <w:r>
+        <w:t>Testing at Nova Clinic — Overview</w:t>
+      </w:r>
+    </w:p>
+    <w:p>
+      <w:r>
+        <w:t>Testing ordered by the naturopathic doctor is not subsidized by the government of Alberta and will be an out-of-pocket expense, but can be billed to extended health insurance. Both types of testing require a naturopathic doctor consultation and will be ordered only if the doctor feels that it is recommended and necessary.</w:t>
+      </w:r>
+    </w:p>
+    <w:p>
+      <w:pPr>
+        <w:pStyle w:val="Heading2"/>
+      </w:pPr>
+      <w:r>
+        <w:t>Two Categories of Testing</w:t>
+      </w:r>
+    </w:p>
+    <w:p>
+      <w:r>
+        <w:t>There are two major categories of testing at Nova Clinic:</w:t>
+        <w:br/>
+        <w:br/>
+        <w:t>1. Standardized Testing — This is similar to what your family doctor is able to order through Alberta Health Services. These are conventional lab tests such as blood work, thyroid panels, cholesterol, blood sugar, and other routine diagnostics.</w:t>
+        <w:br/>
+        <w:br/>
+        <w:t>2. Functional Testing — These tests measure 'sub-clinical' imbalances — areas where the body isn't 'broken' yet but is struggling to maintain balance. Functional tests use blood, stool, saliva, or dried urine to capture data and provide extremely deep insights about one's health. Nova Clinic has partnered with the best functional labs in the world to be able to offer the very best functional tests for our patients.</w:t>
+      </w:r>
+    </w:p>
+    <w:p>
+      <w:pPr>
+        <w:pStyle w:val="Heading2"/>
       </w:pPr>
       <w:r>
         <w:t>Functional Testing — Detailed Test Catalog</w:t>
@@ -346,17 +378,27 @@
         <w:pStyle w:val="Heading2"/>
       </w:pPr>
       <w:r>
-        <w:t>Food Sensitivity vs Food Allergy Testing — Key Differences</w:t>
+        <w:t>Understanding Food Reactions — Allergies, Sensitivities, and Intolerances</w:t>
       </w:r>
     </w:p>
     <w:p>
       <w:r>
-        <w:t>Nova Clinic offers two distinct food-related tests that are often confused. The IgG Food Sensitivity Test detects delayed immune reactions (IgG antibodies) to foods that may cause symptoms hours or days after eating. Common symptoms include bloating, migraines, fatigue, and inflammation. The test uses a simple finger-prick blood sample and results take 7–10 days.</w:t>
+        <w:t>Food reactions can be of three types: food allergies, food sensitivities, and food intolerances. While some people may think they have a food allergy, it might be a food intolerance instead, especially if the symptoms involve histamine. Since ALL adverse food reactions create inflammation in the body, it is important to identify which food reaction is occurring and treat it accordingly. Testing may or may not be required, but the naturopathic doctor will help identify the problem and may request a test if necessary.</w:t>
       </w:r>
     </w:p>
     <w:p>
       <w:r>
-        <w:t>The IgE Food Allergy Test detects immediate allergic reactions (IgE antibodies) that can cause symptoms within minutes, including hives, swelling, and anaphylaxis. This test requires a standard blood draw. If a patient is unsure which test they need, a naturopathic consultation will help determine the most appropriate option.</w:t>
+        <w:t>Food Allergies (IgE-mediated): These are immediate immune reactions triggered by IgE antibodies. Symptoms can appear within minutes and include hives, swelling, difficulty breathing, and in severe cases, anaphylaxis. Food allergies are commonly associated with histamine release — when the immune system overreacts, it triggers mast cells to release histamine, causing many of the classic allergy symptoms. Common allergens include peanuts, tree nuts, shellfish, milk, eggs, and wheat. The IgE Food Allergy Test at Nova Clinic detects these true allergic responses.</w:t>
+      </w:r>
+    </w:p>
+    <w:p>
+      <w:r>
+        <w:t>Food Sensitivities (IgG-mediated): These are delayed immune reactions triggered by IgG antibodies. Unlike food allergies and intolerances, food sensitivities are not commonly associated with histamine. Symptoms may appear hours or even days after eating and include bloating, migraines, fatigue, joint pain, skin issues, and chronic inflammation. Because of the delay, food sensitivities are often harder to identify without testing. The IgG Food Sensitivity Test at Nova Clinic helps pinpoint these reactions.</w:t>
+      </w:r>
+    </w:p>
+    <w:p>
+      <w:r>
+        <w:t>Food Intolerances (non-immune): These are reactions that do not involve the immune system directly. They are often caused by enzyme deficiencies (e.g. lactose intolerance), sensitivity to food chemicals (e.g. histamine, sulfites, caffeine), or other digestive issues. Symptoms typically involve the digestive system — gas, bloating, diarrhea, stomach pain — and can often be mistaken for food allergies, especially when histamine is involved. A naturopathic doctor can help distinguish intolerances from true allergies or sensitivities and recommend the right approach.</w:t>
       </w:r>
     </w:p>
     <w:p>

</xml_diff>